<commit_message>
Pertemuan 4: tampilan halaman profil dan worksheet selesai
</commit_message>
<xml_diff>
--- a/BENING AFFINA - - 4. Worksheet_PABW_Pertemuan4.docx
+++ b/BENING AFFINA - - 4. Worksheet_PABW_Pertemuan4.docx
@@ -2217,7 +2217,25 @@
           <w:p>
             <w:pPr>
               <w:spacing w:before="20" w:after="20" w:line="252" w:lineRule="auto"/>
-            </w:pPr>
+              <w:rPr>
+                <w:sz w:val="18"/>
+                <w:szCs w:val="18"/>
+              </w:rPr>
+            </w:pPr>
+            <w:r>
+              <w:rPr>
+                <w:sz w:val="18"/>
+                <w:szCs w:val="18"/>
+              </w:rPr>
+              <w:t>#F</w:t>
+            </w:r>
+            <w:r>
+              <w:rPr>
+                <w:sz w:val="18"/>
+                <w:szCs w:val="18"/>
+              </w:rPr>
+              <w:t>FF5F7</w:t>
+            </w:r>
           </w:p>
         </w:tc>
       </w:tr>
@@ -2313,7 +2331,25 @@
           <w:p>
             <w:pPr>
               <w:spacing w:before="20" w:after="20" w:line="252" w:lineRule="auto"/>
-            </w:pPr>
+              <w:rPr>
+                <w:sz w:val="18"/>
+                <w:szCs w:val="18"/>
+              </w:rPr>
+            </w:pPr>
+            <w:r>
+              <w:rPr>
+                <w:sz w:val="18"/>
+                <w:szCs w:val="18"/>
+              </w:rPr>
+              <w:t>#</w:t>
+            </w:r>
+            <w:r>
+              <w:rPr>
+                <w:sz w:val="18"/>
+                <w:szCs w:val="18"/>
+              </w:rPr>
+              <w:t>1F1720</w:t>
+            </w:r>
           </w:p>
         </w:tc>
       </w:tr>
@@ -2406,6 +2442,20 @@
             <w:pPr>
               <w:spacing w:before="20" w:after="20" w:line="252" w:lineRule="auto"/>
             </w:pPr>
+            <w:r>
+              <w:rPr>
+                <w:rFonts w:cs="Carlito"/>
+                <w:sz w:val="18"/>
+              </w:rPr>
+              <w:t>#</w:t>
+            </w:r>
+            <w:r>
+              <w:rPr>
+                <w:rFonts w:cs="Carlito"/>
+                <w:sz w:val="18"/>
+              </w:rPr>
+              <w:t>FFFFFF</w:t>
+            </w:r>
           </w:p>
         </w:tc>
       </w:tr>
@@ -2501,7 +2551,25 @@
           <w:p>
             <w:pPr>
               <w:spacing w:before="20" w:after="20" w:line="252" w:lineRule="auto"/>
-            </w:pPr>
+              <w:rPr>
+                <w:sz w:val="18"/>
+                <w:szCs w:val="18"/>
+              </w:rPr>
+            </w:pPr>
+            <w:r>
+              <w:rPr>
+                <w:sz w:val="18"/>
+                <w:szCs w:val="18"/>
+              </w:rPr>
+              <w:t>#</w:t>
+            </w:r>
+            <w:r>
+              <w:rPr>
+                <w:sz w:val="18"/>
+                <w:szCs w:val="18"/>
+              </w:rPr>
+              <w:t>E5B8C5</w:t>
+            </w:r>
           </w:p>
         </w:tc>
       </w:tr>
@@ -2593,7 +2661,25 @@
           <w:p>
             <w:pPr>
               <w:spacing w:before="20" w:after="20" w:line="252" w:lineRule="auto"/>
-            </w:pPr>
+              <w:rPr>
+                <w:sz w:val="18"/>
+                <w:szCs w:val="18"/>
+              </w:rPr>
+            </w:pPr>
+            <w:r>
+              <w:rPr>
+                <w:sz w:val="18"/>
+                <w:szCs w:val="18"/>
+              </w:rPr>
+              <w:t>#</w:t>
+            </w:r>
+            <w:r>
+              <w:rPr>
+                <w:sz w:val="18"/>
+                <w:szCs w:val="18"/>
+              </w:rPr>
+              <w:t>BE185D</w:t>
+            </w:r>
           </w:p>
         </w:tc>
       </w:tr>
@@ -2690,6 +2776,13 @@
             <w:pPr>
               <w:spacing w:before="20" w:after="20" w:line="252" w:lineRule="auto"/>
             </w:pPr>
+            <w:r>
+              <w:rPr>
+                <w:rFonts w:cs="Carlito"/>
+                <w:sz w:val="18"/>
+              </w:rPr>
+              <w:t>#B00020</w:t>
+            </w:r>
           </w:p>
         </w:tc>
       </w:tr>
@@ -2781,7 +2874,25 @@
           <w:p>
             <w:pPr>
               <w:spacing w:before="20" w:after="20" w:line="252" w:lineRule="auto"/>
-            </w:pPr>
+              <w:rPr>
+                <w:sz w:val="18"/>
+                <w:szCs w:val="18"/>
+              </w:rPr>
+            </w:pPr>
+            <w:r>
+              <w:rPr>
+                <w:sz w:val="18"/>
+                <w:szCs w:val="18"/>
+              </w:rPr>
+              <w:t>#</w:t>
+            </w:r>
+            <w:r>
+              <w:rPr>
+                <w:sz w:val="18"/>
+                <w:szCs w:val="18"/>
+              </w:rPr>
+              <w:t>DB2777</w:t>
+            </w:r>
           </w:p>
         </w:tc>
       </w:tr>
@@ -3077,7 +3188,18 @@
           <w:p>
             <w:pPr>
               <w:spacing w:before="20" w:after="20" w:line="252" w:lineRule="auto"/>
-            </w:pPr>
+              <w:rPr>
+                <w:sz w:val="18"/>
+                <w:szCs w:val="18"/>
+              </w:rPr>
+            </w:pPr>
+            <w:r>
+              <w:rPr>
+                <w:sz w:val="18"/>
+                <w:szCs w:val="18"/>
+              </w:rPr>
+              <w:t>0.25rem</w:t>
+            </w:r>
           </w:p>
         </w:tc>
       </w:tr>
@@ -3173,7 +3295,18 @@
           <w:p>
             <w:pPr>
               <w:spacing w:before="20" w:after="20" w:line="252" w:lineRule="auto"/>
-            </w:pPr>
+              <w:rPr>
+                <w:sz w:val="18"/>
+                <w:szCs w:val="18"/>
+              </w:rPr>
+            </w:pPr>
+            <w:r>
+              <w:rPr>
+                <w:sz w:val="18"/>
+                <w:szCs w:val="18"/>
+              </w:rPr>
+              <w:t>0.5rem</w:t>
+            </w:r>
           </w:p>
         </w:tc>
       </w:tr>
@@ -3265,7 +3398,18 @@
           <w:p>
             <w:pPr>
               <w:spacing w:before="20" w:after="20" w:line="252" w:lineRule="auto"/>
-            </w:pPr>
+              <w:rPr>
+                <w:sz w:val="18"/>
+                <w:szCs w:val="18"/>
+              </w:rPr>
+            </w:pPr>
+            <w:r>
+              <w:rPr>
+                <w:sz w:val="18"/>
+                <w:szCs w:val="18"/>
+              </w:rPr>
+              <w:t>0.75rem</w:t>
+            </w:r>
           </w:p>
         </w:tc>
       </w:tr>
@@ -3361,7 +3505,18 @@
           <w:p>
             <w:pPr>
               <w:spacing w:before="20" w:after="20" w:line="252" w:lineRule="auto"/>
-            </w:pPr>
+              <w:rPr>
+                <w:sz w:val="18"/>
+                <w:szCs w:val="18"/>
+              </w:rPr>
+            </w:pPr>
+            <w:r>
+              <w:rPr>
+                <w:sz w:val="18"/>
+                <w:szCs w:val="18"/>
+              </w:rPr>
+              <w:t>1rem</w:t>
+            </w:r>
           </w:p>
         </w:tc>
       </w:tr>
@@ -3453,7 +3608,18 @@
           <w:p>
             <w:pPr>
               <w:spacing w:before="20" w:after="20" w:line="252" w:lineRule="auto"/>
-            </w:pPr>
+              <w:rPr>
+                <w:sz w:val="18"/>
+                <w:szCs w:val="18"/>
+              </w:rPr>
+            </w:pPr>
+            <w:r>
+              <w:rPr>
+                <w:sz w:val="18"/>
+                <w:szCs w:val="18"/>
+              </w:rPr>
+              <w:t>1.5rem</w:t>
+            </w:r>
           </w:p>
         </w:tc>
       </w:tr>
@@ -3549,7 +3715,18 @@
           <w:p>
             <w:pPr>
               <w:spacing w:before="20" w:after="20" w:line="252" w:lineRule="auto"/>
-            </w:pPr>
+              <w:rPr>
+                <w:sz w:val="18"/>
+                <w:szCs w:val="18"/>
+              </w:rPr>
+            </w:pPr>
+            <w:r>
+              <w:rPr>
+                <w:sz w:val="18"/>
+                <w:szCs w:val="18"/>
+              </w:rPr>
+              <w:t>0.5rem</w:t>
+            </w:r>
           </w:p>
         </w:tc>
       </w:tr>
@@ -3641,7 +3818,18 @@
           <w:p>
             <w:pPr>
               <w:spacing w:before="20" w:after="20" w:line="252" w:lineRule="auto"/>
-            </w:pPr>
+              <w:rPr>
+                <w:sz w:val="18"/>
+                <w:szCs w:val="18"/>
+              </w:rPr>
+            </w:pPr>
+            <w:r>
+              <w:rPr>
+                <w:sz w:val="18"/>
+                <w:szCs w:val="18"/>
+              </w:rPr>
+              <w:t>999px</w:t>
+            </w:r>
           </w:p>
         </w:tc>
       </w:tr>
@@ -3738,6 +3926,13 @@
             <w:pPr>
               <w:spacing w:before="20" w:after="20" w:line="252" w:lineRule="auto"/>
             </w:pPr>
+            <w:r>
+              <w:rPr>
+                <w:rFonts w:cs="Carlito"/>
+                <w:sz w:val="18"/>
+              </w:rPr>
+              <w:t>0 1px 3px rgba(0,0,0,.10)</w:t>
+            </w:r>
           </w:p>
         </w:tc>
       </w:tr>
@@ -3830,6 +4025,13 @@
             <w:pPr>
               <w:spacing w:before="20" w:after="20" w:line="252" w:lineRule="auto"/>
             </w:pPr>
+            <w:r>
+              <w:rPr>
+                <w:rFonts w:cs="Carlito"/>
+                <w:sz w:val="18"/>
+              </w:rPr>
+              <w:t>0.875rem</w:t>
+            </w:r>
           </w:p>
         </w:tc>
       </w:tr>
@@ -3925,7 +4127,18 @@
           <w:p>
             <w:pPr>
               <w:spacing w:before="20" w:after="20" w:line="252" w:lineRule="auto"/>
-            </w:pPr>
+              <w:rPr>
+                <w:sz w:val="18"/>
+                <w:szCs w:val="18"/>
+              </w:rPr>
+            </w:pPr>
+            <w:r>
+              <w:rPr>
+                <w:sz w:val="18"/>
+                <w:szCs w:val="18"/>
+              </w:rPr>
+              <w:t>1rem</w:t>
+            </w:r>
           </w:p>
         </w:tc>
       </w:tr>
@@ -4017,7 +4230,18 @@
           <w:p>
             <w:pPr>
               <w:spacing w:before="20" w:after="20" w:line="252" w:lineRule="auto"/>
-            </w:pPr>
+              <w:rPr>
+                <w:sz w:val="18"/>
+                <w:szCs w:val="18"/>
+              </w:rPr>
+            </w:pPr>
+            <w:r>
+              <w:rPr>
+                <w:sz w:val="18"/>
+                <w:szCs w:val="18"/>
+              </w:rPr>
+              <w:t>1.5rem</w:t>
+            </w:r>
           </w:p>
         </w:tc>
       </w:tr>
@@ -4113,7 +4337,18 @@
           <w:p>
             <w:pPr>
               <w:spacing w:before="20" w:after="20" w:line="252" w:lineRule="auto"/>
-            </w:pPr>
+              <w:rPr>
+                <w:sz w:val="18"/>
+                <w:szCs w:val="18"/>
+              </w:rPr>
+            </w:pPr>
+            <w:r>
+              <w:rPr>
+                <w:sz w:val="18"/>
+                <w:szCs w:val="18"/>
+              </w:rPr>
+              <w:t>2.25rem</w:t>
+            </w:r>
           </w:p>
         </w:tc>
       </w:tr>
@@ -4177,16 +4412,7 @@
                 <w:color w:val="1A1A2E"/>
                 <w:sz w:val="20"/>
               </w:rPr>
-              <w:t xml:space="preserve">Kriterianya satu: Anda dapat mengubah warna utama halaman di SATU baris di tokens.css, lalu seluruh halaman ikut berubah — tombol, tautan, judul, garis fokus, semuanya </w:t>
-            </w:r>
-            <w:r>
-              <w:rPr>
-                <w:rFonts w:cs="Carlito"/>
-                <w:color w:val="1A1A2E"/>
-                <w:sz w:val="20"/>
-              </w:rPr>
-              <w:lastRenderedPageBreak/>
-              <w:t>— tanpa menyunting berkas lain. Bila Anda masih harus mencari warna itu di berkas lain, pekerjaan hari ini belum selesai. Anda menguji ini di Lembar G.</w:t>
+              <w:t>Kriterianya satu: Anda dapat mengubah warna utama halaman di SATU baris di tokens.css, lalu seluruh halaman ikut berubah — tombol, tautan, judul, garis fokus, semuanya — tanpa menyunting berkas lain. Bila Anda masih harus mencari warna itu di berkas lain, pekerjaan hari ini belum selesai. Anda menguji ini di Lembar G.</w:t>
             </w:r>
           </w:p>
         </w:tc>
@@ -5017,7 +5243,6 @@
           <w:i/>
           <w:sz w:val="19"/>
         </w:rPr>
-        <w:lastRenderedPageBreak/>
         <w:t>Cara memastikan: buka halaman repositori Anda di github.com. README harus tampil memuat bagian “Pertemuan 4”. Yang tersimpan di commit ini bukan kode, melainkan rencana — dan itu memang yang dihasilkan Lembar A.</w:t>
       </w:r>
     </w:p>
@@ -6661,6 +6886,20 @@
               </w:rPr>
               <w:t>C</w:t>
             </w:r>
+            <w:r>
+              <w:rPr>
+                <w:rFonts w:cs="Carlito"/>
+                <w:sz w:val="19"/>
+              </w:rPr>
+              <w:t xml:space="preserve"> </w:t>
+            </w:r>
+            <w:r>
+              <w:rPr>
+                <w:rFonts w:cs="Carlito"/>
+                <w:sz w:val="19"/>
+              </w:rPr>
+              <w:t>(sudah)</w:t>
+            </w:r>
           </w:p>
         </w:tc>
       </w:tr>
@@ -6738,6 +6977,20 @@
               </w:rPr>
               <w:t>D</w:t>
             </w:r>
+            <w:r>
+              <w:rPr>
+                <w:rFonts w:cs="Carlito"/>
+                <w:sz w:val="19"/>
+              </w:rPr>
+              <w:t xml:space="preserve"> </w:t>
+            </w:r>
+            <w:r>
+              <w:rPr>
+                <w:rFonts w:cs="Carlito"/>
+                <w:sz w:val="19"/>
+              </w:rPr>
+              <w:t>(sudah)</w:t>
+            </w:r>
           </w:p>
         </w:tc>
       </w:tr>
@@ -6817,6 +7070,20 @@
               </w:rPr>
               <w:t>D dan E</w:t>
             </w:r>
+            <w:r>
+              <w:rPr>
+                <w:rFonts w:cs="Carlito"/>
+                <w:sz w:val="19"/>
+              </w:rPr>
+              <w:t xml:space="preserve"> </w:t>
+            </w:r>
+            <w:r>
+              <w:rPr>
+                <w:rFonts w:cs="Carlito"/>
+                <w:sz w:val="19"/>
+              </w:rPr>
+              <w:t>(sudah)</w:t>
+            </w:r>
           </w:p>
         </w:tc>
       </w:tr>
@@ -6892,6 +7159,20 @@
                 <w:sz w:val="19"/>
               </w:rPr>
               <w:t>F</w:t>
+            </w:r>
+            <w:r>
+              <w:rPr>
+                <w:rFonts w:cs="Carlito"/>
+                <w:sz w:val="19"/>
+              </w:rPr>
+              <w:t xml:space="preserve"> </w:t>
+            </w:r>
+            <w:r>
+              <w:rPr>
+                <w:rFonts w:cs="Carlito"/>
+                <w:sz w:val="19"/>
+              </w:rPr>
+              <w:t>(sudah)</w:t>
             </w:r>
           </w:p>
         </w:tc>
@@ -7088,6 +7369,9 @@
             <w:pPr>
               <w:spacing w:before="20" w:after="20" w:line="252" w:lineRule="auto"/>
             </w:pPr>
+            <w:r>
+              <w:t>Tidak ada galat</w:t>
+            </w:r>
           </w:p>
         </w:tc>
       </w:tr>
@@ -7160,6 +7444,9 @@
             <w:pPr>
               <w:spacing w:before="20" w:after="20" w:line="252" w:lineRule="auto"/>
             </w:pPr>
+            <w:r>
+              <w:t>Kelima berkas 200</w:t>
+            </w:r>
           </w:p>
         </w:tc>
       </w:tr>
@@ -7229,6 +7516,12 @@
             <w:pPr>
               <w:spacing w:before="20" w:after="20" w:line="252" w:lineRule="auto"/>
             </w:pPr>
+            <w:r>
+              <w:t>Terlihat seluruh token</w:t>
+            </w:r>
+            <w:r>
+              <w:t xml:space="preserve"> di panel Styles</w:t>
+            </w:r>
           </w:p>
         </w:tc>
       </w:tr>
@@ -11710,6 +12003,9 @@
             <w:pPr>
               <w:spacing w:before="20" w:after="20" w:line="252" w:lineRule="auto"/>
             </w:pPr>
+            <w:r>
+              <w:t>Sudah sesuai</w:t>
+            </w:r>
           </w:p>
         </w:tc>
       </w:tr>
@@ -11782,6 +12078,9 @@
             <w:pPr>
               <w:spacing w:before="20" w:after="20" w:line="252" w:lineRule="auto"/>
             </w:pPr>
+            <w:r>
+              <w:t>Sudah sesuai</w:t>
+            </w:r>
           </w:p>
         </w:tc>
       </w:tr>
@@ -11851,6 +12150,9 @@
             <w:pPr>
               <w:spacing w:before="20" w:after="20" w:line="252" w:lineRule="auto"/>
             </w:pPr>
+            <w:r>
+              <w:t>Sudah sesuai</w:t>
+            </w:r>
           </w:p>
         </w:tc>
       </w:tr>
@@ -11923,6 +12225,9 @@
             <w:pPr>
               <w:spacing w:before="20" w:after="20" w:line="252" w:lineRule="auto"/>
             </w:pPr>
+            <w:r>
+              <w:t>Sudah sesuai</w:t>
+            </w:r>
           </w:p>
         </w:tc>
       </w:tr>
@@ -16024,7 +16329,18 @@
           <w:p>
             <w:pPr>
               <w:spacing w:before="20" w:after="20" w:line="252" w:lineRule="auto"/>
-            </w:pPr>
+              <w:rPr>
+                <w:sz w:val="18"/>
+                <w:szCs w:val="18"/>
+              </w:rPr>
+            </w:pPr>
+            <w:r>
+              <w:rPr>
+                <w:sz w:val="18"/>
+                <w:szCs w:val="18"/>
+              </w:rPr>
+              <w:t>16.36:1</w:t>
+            </w:r>
           </w:p>
         </w:tc>
         <w:tc>
@@ -16040,7 +16356,18 @@
           <w:p>
             <w:pPr>
               <w:spacing w:before="20" w:after="20" w:line="252" w:lineRule="auto"/>
-            </w:pPr>
+              <w:rPr>
+                <w:sz w:val="18"/>
+                <w:szCs w:val="18"/>
+              </w:rPr>
+            </w:pPr>
+            <w:r>
+              <w:rPr>
+                <w:sz w:val="18"/>
+                <w:szCs w:val="18"/>
+              </w:rPr>
+              <w:t>8.84:1</w:t>
+            </w:r>
           </w:p>
         </w:tc>
         <w:tc>
@@ -16111,7 +16438,39 @@
           <w:p>
             <w:pPr>
               <w:spacing w:before="20" w:after="20" w:line="252" w:lineRule="auto"/>
-            </w:pPr>
+              <w:rPr>
+                <w:sz w:val="18"/>
+                <w:szCs w:val="18"/>
+              </w:rPr>
+            </w:pPr>
+            <w:r>
+              <w:rPr>
+                <w:sz w:val="18"/>
+                <w:szCs w:val="18"/>
+              </w:rPr>
+              <w:t>5</w:t>
+            </w:r>
+            <w:r>
+              <w:rPr>
+                <w:sz w:val="18"/>
+                <w:szCs w:val="18"/>
+              </w:rPr>
+              <w:t>.</w:t>
+            </w:r>
+            <w:r>
+              <w:rPr>
+                <w:sz w:val="18"/>
+                <w:szCs w:val="18"/>
+              </w:rPr>
+              <w:t>65</w:t>
+            </w:r>
+            <w:r>
+              <w:rPr>
+                <w:sz w:val="18"/>
+                <w:szCs w:val="18"/>
+              </w:rPr>
+              <w:t>:1</w:t>
+            </w:r>
           </w:p>
         </w:tc>
         <w:tc>
@@ -16128,7 +16487,39 @@
           <w:p>
             <w:pPr>
               <w:spacing w:before="20" w:after="20" w:line="252" w:lineRule="auto"/>
-            </w:pPr>
+              <w:rPr>
+                <w:sz w:val="18"/>
+                <w:szCs w:val="18"/>
+              </w:rPr>
+            </w:pPr>
+            <w:r>
+              <w:rPr>
+                <w:sz w:val="18"/>
+                <w:szCs w:val="18"/>
+              </w:rPr>
+              <w:t>5</w:t>
+            </w:r>
+            <w:r>
+              <w:rPr>
+                <w:sz w:val="18"/>
+                <w:szCs w:val="18"/>
+              </w:rPr>
+              <w:t>.6</w:t>
+            </w:r>
+            <w:r>
+              <w:rPr>
+                <w:sz w:val="18"/>
+                <w:szCs w:val="18"/>
+              </w:rPr>
+              <w:t>8</w:t>
+            </w:r>
+            <w:r>
+              <w:rPr>
+                <w:sz w:val="18"/>
+                <w:szCs w:val="18"/>
+              </w:rPr>
+              <w:t>:1</w:t>
+            </w:r>
           </w:p>
         </w:tc>
         <w:tc>
@@ -16198,7 +16589,18 @@
           <w:p>
             <w:pPr>
               <w:spacing w:before="20" w:after="20" w:line="252" w:lineRule="auto"/>
-            </w:pPr>
+              <w:rPr>
+                <w:sz w:val="18"/>
+                <w:szCs w:val="18"/>
+              </w:rPr>
+            </w:pPr>
+            <w:r>
+              <w:rPr>
+                <w:sz w:val="18"/>
+                <w:szCs w:val="18"/>
+              </w:rPr>
+              <w:t>16.36:1</w:t>
+            </w:r>
           </w:p>
         </w:tc>
         <w:tc>
@@ -16214,7 +16616,18 @@
           <w:p>
             <w:pPr>
               <w:spacing w:before="20" w:after="20" w:line="252" w:lineRule="auto"/>
-            </w:pPr>
+              <w:rPr>
+                <w:sz w:val="18"/>
+                <w:szCs w:val="18"/>
+              </w:rPr>
+            </w:pPr>
+            <w:r>
+              <w:rPr>
+                <w:sz w:val="18"/>
+                <w:szCs w:val="18"/>
+              </w:rPr>
+              <w:t>8.84:1</w:t>
+            </w:r>
           </w:p>
         </w:tc>
         <w:tc>
@@ -16285,7 +16698,18 @@
           <w:p>
             <w:pPr>
               <w:spacing w:before="20" w:after="20" w:line="252" w:lineRule="auto"/>
-            </w:pPr>
+              <w:rPr>
+                <w:sz w:val="18"/>
+                <w:szCs w:val="18"/>
+              </w:rPr>
+            </w:pPr>
+            <w:r>
+              <w:rPr>
+                <w:sz w:val="18"/>
+                <w:szCs w:val="18"/>
+              </w:rPr>
+              <w:t>4.30:1</w:t>
+            </w:r>
           </w:p>
         </w:tc>
         <w:tc>
@@ -16302,7 +16726,18 @@
           <w:p>
             <w:pPr>
               <w:spacing w:before="20" w:after="20" w:line="252" w:lineRule="auto"/>
-            </w:pPr>
+              <w:rPr>
+                <w:sz w:val="18"/>
+                <w:szCs w:val="18"/>
+              </w:rPr>
+            </w:pPr>
+            <w:r>
+              <w:rPr>
+                <w:sz w:val="18"/>
+                <w:szCs w:val="18"/>
+              </w:rPr>
+              <w:t>3.64:1</w:t>
+            </w:r>
           </w:p>
         </w:tc>
         <w:tc>
@@ -16372,7 +16807,39 @@
           <w:p>
             <w:pPr>
               <w:spacing w:before="20" w:after="20" w:line="252" w:lineRule="auto"/>
-            </w:pPr>
+              <w:rPr>
+                <w:sz w:val="18"/>
+                <w:szCs w:val="18"/>
+              </w:rPr>
+            </w:pPr>
+            <w:r>
+              <w:rPr>
+                <w:sz w:val="18"/>
+                <w:szCs w:val="18"/>
+              </w:rPr>
+              <w:t>4</w:t>
+            </w:r>
+            <w:r>
+              <w:rPr>
+                <w:sz w:val="18"/>
+                <w:szCs w:val="18"/>
+              </w:rPr>
+              <w:t>.</w:t>
+            </w:r>
+            <w:r>
+              <w:rPr>
+                <w:sz w:val="18"/>
+                <w:szCs w:val="18"/>
+              </w:rPr>
+              <w:t>39</w:t>
+            </w:r>
+            <w:r>
+              <w:rPr>
+                <w:sz w:val="18"/>
+                <w:szCs w:val="18"/>
+              </w:rPr>
+              <w:t>:1</w:t>
+            </w:r>
           </w:p>
         </w:tc>
         <w:tc>
@@ -16388,7 +16855,39 @@
           <w:p>
             <w:pPr>
               <w:spacing w:before="20" w:after="20" w:line="252" w:lineRule="auto"/>
-            </w:pPr>
+              <w:rPr>
+                <w:sz w:val="18"/>
+                <w:szCs w:val="18"/>
+              </w:rPr>
+            </w:pPr>
+            <w:r>
+              <w:rPr>
+                <w:sz w:val="18"/>
+                <w:szCs w:val="18"/>
+              </w:rPr>
+              <w:t>3</w:t>
+            </w:r>
+            <w:r>
+              <w:rPr>
+                <w:sz w:val="18"/>
+                <w:szCs w:val="18"/>
+              </w:rPr>
+              <w:t>.</w:t>
+            </w:r>
+            <w:r>
+              <w:rPr>
+                <w:sz w:val="18"/>
+                <w:szCs w:val="18"/>
+              </w:rPr>
+              <w:t>30</w:t>
+            </w:r>
+            <w:r>
+              <w:rPr>
+                <w:sz w:val="18"/>
+                <w:szCs w:val="18"/>
+              </w:rPr>
+              <w:t>:1</w:t>
+            </w:r>
           </w:p>
         </w:tc>
         <w:tc>
@@ -16584,6 +17083,9 @@
             <w:pPr>
               <w:spacing w:before="20" w:after="20" w:line="252" w:lineRule="auto"/>
             </w:pPr>
+            <w:r>
+              <w:t>Benar</w:t>
+            </w:r>
           </w:p>
         </w:tc>
       </w:tr>
@@ -16656,6 +17158,9 @@
             <w:pPr>
               <w:spacing w:before="20" w:after="20" w:line="252" w:lineRule="auto"/>
             </w:pPr>
+            <w:r>
+              <w:t>Benar</w:t>
+            </w:r>
           </w:p>
         </w:tc>
       </w:tr>
@@ -16725,6 +17230,9 @@
             <w:pPr>
               <w:spacing w:before="20" w:after="20" w:line="252" w:lineRule="auto"/>
             </w:pPr>
+            <w:r>
+              <w:t>Benar</w:t>
+            </w:r>
           </w:p>
         </w:tc>
       </w:tr>
@@ -16797,6 +17305,9 @@
             <w:pPr>
               <w:spacing w:before="20" w:after="20" w:line="252" w:lineRule="auto"/>
             </w:pPr>
+            <w:r>
+              <w:t>Benar</w:t>
+            </w:r>
           </w:p>
         </w:tc>
       </w:tr>
@@ -25301,7 +25812,6 @@
   <w:style w:type="character" w:default="1" w:styleId="DefaultParagraphFont">
     <w:name w:val="Default Paragraph Font"/>
     <w:uiPriority w:val="1"/>
-    <w:semiHidden/>
     <w:unhideWhenUsed/>
   </w:style>
   <w:style w:type="table" w:default="1" w:styleId="TableNormal">

</xml_diff>